<commit_message>
JCF package: disclose code assistance and tighten supplement wording
Extend the AI-use statement to name Claude as a coding aid for the analysis code, and update the submission README to match. Supplement B.1, B.3, B.4, Table S2 and Appendix A.4 reworded; main-text date wording and the duplicated word in the contribution list corrected. Package rebuilt; manifest.sha256 regenerated and verified (16 entries).

Co-Authored-By: Claude Haiku 5.5 <noreply@anthropic.com>
</commit_message>
<xml_diff>
--- a/docs/cpiv-jcf/submission/manuscript_jcf_draft.docx
+++ b/docs/cpiv-jcf/submission/manuscript_jcf_draft.docx
@@ -360,7 +360,7 @@
         <w:t xml:space="preserve"> </w:t>
       </w:r>
       <w:r>
-        <w:t xml:space="preserve">preserves within-day dependence. Because the study uses no market data, the protocol is validated on a synthetic instrument whose true spread is defined before any quote exists, under an addendum dated before the sweep. In the</w:t>
+        <w:t xml:space="preserve">preserves within-day dependence. With no market data, the protocol is validated on a synthetic instrument whose true spread is defined before any quote exists, under an addendum dated 22 October 2026 (the sweep’s date). In the</w:t>
       </w:r>
       <w:r>
         <w:t xml:space="preserve"> </w:t>
@@ -478,7 +478,7 @@
         </w:numPr>
       </w:pPr>
       <w:r>
-        <w:t xml:space="preserve">Thresholds were declared in an addendum dated before the sweep</w:t>
+        <w:t xml:space="preserve">Thresholds were declared in an addendum dated the same day as the sweep</w:t>
       </w:r>
     </w:p>
     <w:bookmarkEnd w:id="12"/>
@@ -783,13 +783,13 @@
         <w:t xml:space="preserve"> </w:t>
       </w:r>
       <w:r>
-        <w:t xml:space="preserve">Each is a genuine improvement on the raw midpoint, and each is reported here</w:t>
-      </w:r>
-      <w:r>
-        <w:t xml:space="preserve"> </w:t>
-      </w:r>
-      <w:r>
-        <w:t xml:space="preserve">as a declared baseline.</w:t>
+        <w:t xml:space="preserve">Each is declared here as a baseline. Section 6 scores only the bound-filtered</w:t>
+      </w:r>
+      <w:r>
+        <w:t xml:space="preserve"> </w:t>
+      </w:r>
+      <w:r>
+        <w:t xml:space="preserve">midpoint of these; the endpoint interval and the parity residual are described, not scored.</w:t>
       </w:r>
       <w:r>
         <w:t xml:space="preserve"> </w:t>
@@ -857,7 +857,7 @@
         <w:pStyle w:val="BodyText"/>
       </w:pPr>
       <w:r>
-        <w:t xml:space="preserve">That has a consequence that is easy to state and easy to avoid stating: on</w:t>
+        <w:t xml:space="preserve">The consequence is easy to state and easy to avoid stating: on</w:t>
       </w:r>
       <w:r>
         <w:t xml:space="preserve"> </w:t>
@@ -1351,7 +1351,7 @@
         <w:t xml:space="preserve"> </w:t>
       </w:r>
       <w:r>
-        <w:t xml:space="preserve">addendum written before the replication sweep was run, and the tally reports</w:t>
+        <w:t xml:space="preserve">dated 22 October 2026, the same day as the sweep manifest, and the tally reports</w:t>
       </w:r>
       <w:r>
         <w:t xml:space="preserve"> </w:t>
@@ -2036,7 +2036,7 @@
         <w:pStyle w:val="FirstParagraph"/>
       </w:pPr>
       <w:r>
-        <w:t xml:space="preserve">Five baselines are declared in the addendum, and each is reported:</w:t>
+        <w:t xml:space="preserve">Five baselines are declared in the addendum. Section 6 scores three of them, the raw midpoint, the bound-filtered midpoint and the protocol; the endpoint interval and the parity residual are described only:</w:t>
       </w:r>
       <w:r>
         <w:t xml:space="preserve"> </w:t>
@@ -2380,13 +2380,7 @@
         <w:t xml:space="preserve"> </w:t>
       </w:r>
       <w:r>
-        <w:t xml:space="preserve">better than a random selection that respects the same dependence structure</w:t>
-      </w:r>
-      <w:r>
-        <w:t xml:space="preserve"> </w:t>
-      </w:r>
-      <w:r>
-        <w:t xml:space="preserve">the study’s own confidence intervals respect? A protocol that beats a pair</w:t>
+        <w:t xml:space="preserve">better than a random selection that respects the same dependence? A protocol that beats a pair</w:t>
       </w:r>
       <w:r>
         <w:t xml:space="preserve"> </w:t>
@@ -2464,13 +2458,7 @@
         <w:t xml:space="preserve"> </w:t>
       </w:r>
       <w:r>
-        <w:t xml:space="preserve">One implementation detail matters, and is stated because it affects the</w:t>
-      </w:r>
-      <w:r>
-        <w:t xml:space="preserve"> </w:t>
-      </w:r>
-      <w:r>
-        <w:t xml:space="preserve">result. A block draw must match the certified subset exactly in size, so the</w:t>
+        <w:t xml:space="preserve">One implementation detail affects the result. A block draw must match the certified subset exactly in size, so the</w:t>
       </w:r>
       <w:r>
         <w:t xml:space="preserve"> </w:t>
@@ -4189,7 +4177,7 @@
           <w:i/>
           <w:iCs/>
         </w:rPr>
-        <w:t xml:space="preserve">model artefact</w:t>
+        <w:t xml:space="preserve">model artifact</w:t>
       </w:r>
       <w:r>
         <w:t xml:space="preserve">, and three things follow.</w:t>
@@ -4927,13 +4915,7 @@
         <w:pStyle w:val="FirstParagraph"/>
       </w:pPr>
       <w:r>
-        <w:t xml:space="preserve">The funnel of the development draw (Table 1) is the first result, because it</w:t>
-      </w:r>
-      <w:r>
-        <w:t xml:space="preserve"> </w:t>
-      </w:r>
-      <w:r>
-        <w:t xml:space="preserve">establishes what the protocol is actually rejecting.</w:t>
+        <w:t xml:space="preserve">The funnel of the development draw (Table 1) shows what the protocol rejects.</w:t>
       </w:r>
     </w:p>
     <w:p>
@@ -6694,13 +6676,7 @@
         <w:pStyle w:val="FirstParagraph"/>
       </w:pPr>
       <w:r>
-        <w:t xml:space="preserve">The frontier (Table 3) is the paper’s central result, because it is the only</w:t>
-      </w:r>
-      <w:r>
-        <w:t xml:space="preserve"> </w:t>
-      </w:r>
-      <w:r>
-        <w:t xml:space="preserve">result that speaks to the question the protocol poses.</w:t>
+        <w:t xml:space="preserve">The frontier (Table 3) is the paper’s central result.</w:t>
       </w:r>
       <w:r>
         <w:t xml:space="preserve"> </w:t>
@@ -8180,13 +8156,7 @@
         <w:t xml:space="preserve"> </w:t>
       </w:r>
       <w:r>
-        <w:t xml:space="preserve">That is the substantive result: against the null that respects the within-day</w:t>
-      </w:r>
-      <w:r>
-        <w:t xml:space="preserve"> </w:t>
-      </w:r>
-      <w:r>
-        <w:t xml:space="preserve">dependence of the quotes, the certified set is better, not merely smaller.</w:t>
+        <w:t xml:space="preserve">That is the substantive result: the certified set is better, not merely smaller.</w:t>
       </w:r>
       <w:r>
         <w:t xml:space="preserve"> </w:t>
@@ -8233,13 +8203,7 @@
         <w:t xml:space="preserve"> </w:t>
       </w:r>
       <w:r>
-        <w:t xml:space="preserve">This is the paper’s most important negative result and it is</w:t>
-      </w:r>
-      <w:r>
-        <w:t xml:space="preserve"> </w:t>
-      </w:r>
-      <w:r>
-        <w:t xml:space="preserve">reported as prominently as the passes. The rule required the minimum</w:t>
+        <w:t xml:space="preserve">It is reported as prominently as the passes. The rule required the minimum</w:t>
       </w:r>
       <w:r>
         <w:t xml:space="preserve"> </w:t>
@@ -10157,19 +10121,13 @@
         <w:t xml:space="preserve"> </w:t>
       </w:r>
       <w:r>
-        <w:t xml:space="preserve">The addendum</w:t>
-      </w:r>
-      <w:r>
-        <w:t xml:space="preserve"> </w:t>
-      </w:r>
-      <w:r>
-        <w:t xml:space="preserve">froze the generator, the settings, the seeds, the specifications, the nulls</w:t>
-      </w:r>
-      <w:r>
-        <w:t xml:space="preserve"> </w:t>
-      </w:r>
-      <w:r>
-        <w:t xml:space="preserve">and the rules before the replication outputs were read.</w:t>
+        <w:t xml:space="preserve">The addendum,</w:t>
+      </w:r>
+      <w:r>
+        <w:t xml:space="preserve"> </w:t>
+      </w:r>
+      <w:r>
+        <w:t xml:space="preserve">dated 22 October 2026, the same day as the sweep manifest, fixes the generator, the settings, the seeds, the specifications, the nulls and the rules; Section 5.1 gives the provenance.</w:t>
       </w:r>
       <w:r>
         <w:t xml:space="preserve"> </w:t>
@@ -10310,7 +10268,7 @@
           <w:b/>
           <w:bCs/>
         </w:rPr>
-        <w:t xml:space="preserve">The truth is a model artefact, and the European map is an approximation</w:t>
+        <w:t xml:space="preserve">The truth is a model artifact, and the European map is an approximation</w:t>
       </w:r>
       <w:r>
         <w:rPr>
@@ -10739,12 +10697,6 @@
         <w:t xml:space="preserve"> </w:t>
       </w:r>
       <w:r>
-        <w:t xml:space="preserve">The research that follows has three kinds.</w:t>
-      </w:r>
-      <w:r>
-        <w:t xml:space="preserve"> </w:t>
-      </w:r>
-      <w:r>
         <w:rPr>
           <w:b/>
           <w:bCs/>
@@ -10968,7 +10920,7 @@
         <w:t xml:space="preserve"> </w:t>
       </w:r>
       <w:r>
-        <w:t xml:space="preserve">and the aggregate run artefacts (the study summary, the per-draw sweep</w:t>
+        <w:t xml:space="preserve">and the aggregate run artifacts (the study summary, the per-draw sweep</w:t>
       </w:r>
       <w:r>
         <w:t xml:space="preserve"> </w:t>
@@ -11012,37 +10964,43 @@
         <w:pStyle w:val="FirstParagraph"/>
       </w:pPr>
       <w:r>
-        <w:t xml:space="preserve">The author used Perplexity for deep research and Claude (Anthropic) as an editing</w:t>
-      </w:r>
-      <w:r>
-        <w:t xml:space="preserve"> </w:t>
-      </w:r>
-      <w:r>
-        <w:t xml:space="preserve">aid for the language of this manuscript. No AI system generated a result, a</w:t>
-      </w:r>
-      <w:r>
-        <w:t xml:space="preserve"> </w:t>
-      </w:r>
-      <w:r>
-        <w:t xml:space="preserve">number or a table: every number in this paper is produced by the released code</w:t>
-      </w:r>
-      <w:r>
-        <w:t xml:space="preserve"> </w:t>
-      </w:r>
-      <w:r>
-        <w:t xml:space="preserve">from the released artefacts, and the manuscript build fails if any numeric slot in</w:t>
-      </w:r>
-      <w:r>
-        <w:t xml:space="preserve"> </w:t>
-      </w:r>
-      <w:r>
-        <w:t xml:space="preserve">the text has no corresponding value in those artefacts. The author reviewed all</w:t>
-      </w:r>
-      <w:r>
-        <w:t xml:space="preserve"> </w:t>
-      </w:r>
-      <w:r>
-        <w:t xml:space="preserve">assisted work and is responsible for the entire content of the paper.</w:t>
+        <w:t xml:space="preserve">The author used Perplexity for deep research, and Claude (Anthropic) as an editing</w:t>
+      </w:r>
+      <w:r>
+        <w:t xml:space="preserve"> </w:t>
+      </w:r>
+      <w:r>
+        <w:t xml:space="preserve">aid for the language of this manuscript and as a coding aid for the analysis code.</w:t>
+      </w:r>
+      <w:r>
+        <w:t xml:space="preserve"> </w:t>
+      </w:r>
+      <w:r>
+        <w:t xml:space="preserve">No AI system generated a result, a number or a table: every number in this paper is</w:t>
+      </w:r>
+      <w:r>
+        <w:t xml:space="preserve"> </w:t>
+      </w:r>
+      <w:r>
+        <w:t xml:space="preserve">produced by the released code from the released artifacts, and the manuscript build</w:t>
+      </w:r>
+      <w:r>
+        <w:t xml:space="preserve"> </w:t>
+      </w:r>
+      <w:r>
+        <w:t xml:space="preserve">fails if any numeric slot in the text has no corresponding value in those artifacts.</w:t>
+      </w:r>
+      <w:r>
+        <w:t xml:space="preserve"> </w:t>
+      </w:r>
+      <w:r>
+        <w:t xml:space="preserve">The author reviewed all assisted text and code, ran the test suite, and is</w:t>
+      </w:r>
+      <w:r>
+        <w:t xml:space="preserve"> </w:t>
+      </w:r>
+      <w:r>
+        <w:t xml:space="preserve">responsible for the entire content of the paper.</w:t>
       </w:r>
     </w:p>
     <w:bookmarkEnd w:id="67"/>

</xml_diff>

<commit_message>
Finish JCF package: word counts, lint, section 6.7 wording
Update the stated main-text count to 9,973 and the longest key message to 71 characters in the README, and the claim matrix to the current count. Clarify in section 6.7 that the widening is a quote-side perturbation, not timing. Fix four E501 line-length errors in exploratory_seeds.py so ruff is clean. Package rebuilt; manifest verified (16 entries); full pytest suite 269 passed.

Co-Authored-By: Claude Haiku 5.5 <noreply@anthropic.com>
</commit_message>
<xml_diff>
--- a/docs/cpiv-jcf/submission/manuscript_jcf_draft.docx
+++ b/docs/cpiv-jcf/submission/manuscript_jcf_draft.docx
@@ -9462,13 +9462,13 @@
         <w:t xml:space="preserve"> </w:t>
       </w:r>
       <w:r>
-        <w:t xml:space="preserve">that does not check timestamps will still report numbers. Widening every</w:t>
-      </w:r>
-      <w:r>
-        <w:t xml:space="preserve"> </w:t>
-      </w:r>
-      <w:r>
-        <w:t xml:space="preserve">quote by half a tick does comparable but smaller damage: certified coverage</w:t>
+        <w:t xml:space="preserve">that does not check timestamps will still report numbers. The quote-side widening,</w:t>
+      </w:r>
+      <w:r>
+        <w:t xml:space="preserve"> </w:t>
+      </w:r>
+      <w:r>
+        <w:t xml:space="preserve">every quote by half a tick, does comparable but smaller damage: certified coverage</w:t>
       </w:r>
       <w:r>
         <w:t xml:space="preserve"> </w:t>

</xml_diff>

<commit_message>
JCF package: tighten main text to 9,921 words and rebuild
Remove duplicated sentences in Sections 6.2 and 6.6 and reword two
transitions in Section 6.2 and the self-selection paragraph. The claims,
numbers and the period-split caveat are unchanged. Rebuild the DOCX and
PDF files, refresh the manifest and update the word counts in the
submission README and claim-evidence matrix.

Co-Authored-By: Claude Haiku 5.5 <noreply@anthropic.com>
</commit_message>
<xml_diff>
--- a/docs/cpiv-jcf/submission/manuscript_jcf_draft.docx
+++ b/docs/cpiv-jcf/submission/manuscript_jcf_draft.docx
@@ -5843,19 +5843,13 @@
         <w:t xml:space="preserve"> </w:t>
       </w:r>
       <w:r>
-        <w:t xml:space="preserve">identical and the difference in mean absolute error is exactly zero. The</w:t>
-      </w:r>
-      <w:r>
-        <w:t xml:space="preserve"> </w:t>
-      </w:r>
-      <w:r>
-        <w:t xml:space="preserve">informative comparison is therefore not the one a reader will instinctively</w:t>
-      </w:r>
-      <w:r>
-        <w:t xml:space="preserve"> </w:t>
-      </w:r>
-      <w:r>
-        <w:t xml:space="preserve">make, and Section 6.4 makes it.</w:t>
+        <w:t xml:space="preserve">identical and the difference in mean absolute error is exactly zero, so the</w:t>
+      </w:r>
+      <w:r>
+        <w:t xml:space="preserve"> </w:t>
+      </w:r>
+      <w:r>
+        <w:t xml:space="preserve">informative comparison is the one Section 6.4 makes.</w:t>
       </w:r>
       <w:r>
         <w:t xml:space="preserve"> </w:t>
@@ -5963,19 +5957,13 @@
         <w:t xml:space="preserve"> </w:t>
       </w:r>
       <w:r>
-        <w:t xml:space="preserve">90.5 %. The protocol produces a</w:t>
-      </w:r>
-      <w:r>
-        <w:t xml:space="preserve"> </w:t>
-      </w:r>
-      <w:r>
-        <w:t xml:space="preserve">graded statement — certified, identified but imprecise, unresolved — rather</w:t>
-      </w:r>
-      <w:r>
-        <w:t xml:space="preserve"> </w:t>
-      </w:r>
-      <w:r>
-        <w:t xml:space="preserve">than a binary one, and the grading is informative.</w:t>
+        <w:t xml:space="preserve">90.5 %. The protocol’s output is</w:t>
+      </w:r>
+      <w:r>
+        <w:t xml:space="preserve"> </w:t>
+      </w:r>
+      <w:r>
+        <w:t xml:space="preserve">graded (certified, identified but imprecise, unresolved), not binary.</w:t>
       </w:r>
     </w:p>
     <w:p>
@@ -7812,7 +7800,7 @@
         <w:t xml:space="preserve">verdict.py</w:t>
       </w:r>
       <w:r>
-        <w:t xml:space="preserve">, which applies the rules of the addendum to the sweep outputs and to nothing else. The development draw is excluded from the tally except for R3 and R6, which are computed on its seed (below).</w:t>
+        <w:t xml:space="preserve">, which applies the rules of the addendum to the sweep outputs and to nothing else.</w:t>
       </w:r>
     </w:p>
     <w:p>
@@ -10069,43 +10057,13 @@
         <w:t xml:space="preserve"> </w:t>
       </w:r>
       <w:r>
-        <w:t xml:space="preserve">The distinction between</w:t>
-      </w:r>
-      <w:r>
-        <w:t xml:space="preserve"> </w:t>
-      </w:r>
-      <w:r>
-        <w:t xml:space="preserve">“this method is better”</w:t>
-      </w:r>
-      <w:r>
-        <w:t xml:space="preserve"> </w:t>
-      </w:r>
-      <w:r>
-        <w:t xml:space="preserve">and</w:t>
-      </w:r>
-      <w:r>
-        <w:t xml:space="preserve"> </w:t>
-      </w:r>
-      <w:r>
-        <w:t xml:space="preserve">“this method selected</w:t>
-      </w:r>
-      <w:r>
-        <w:t xml:space="preserve"> </w:t>
-      </w:r>
-      <w:r>
-        <w:t xml:space="preserve">better data”</w:t>
-      </w:r>
-      <w:r>
-        <w:t xml:space="preserve"> </w:t>
-      </w:r>
-      <w:r>
-        <w:t xml:space="preserve">is the difference between a reproducible method and a result</w:t>
-      </w:r>
-      <w:r>
-        <w:t xml:space="preserve"> </w:t>
-      </w:r>
-      <w:r>
-        <w:t xml:space="preserve">that depends on the analyst’s discretion.</w:t>
+        <w:t xml:space="preserve">Distinguishing a better method from a better-selected sample is what keeps</w:t>
+      </w:r>
+      <w:r>
+        <w:t xml:space="preserve"> </w:t>
+      </w:r>
+      <w:r>
+        <w:t xml:space="preserve">the result reproducible.</w:t>
       </w:r>
       <w:r>
         <w:t xml:space="preserve"> </w:t>

</xml_diff>

<commit_message>
JCF package: clarify baselines, shock sizes, R6 units and AI scope
Split the Section 2.4 baseline list into a declaration sentence and a
scoring sentence. State the finite-shock sizes in Section 3.3, define
the sign band in Section 5.2, and give the R6 worst shift in percentage
points (7.9 to 10.1). Explain in Section 6.9 why the surface comparison
uses 296 of the 889 scored pairs (the 60-day slice, the only slice where
both fits exist). The AI statement now names the test suite and build
scripts, and records that the addendum was written without AI assistance.

Co-Authored-By: Claude Haiku 5.5 <noreply@anthropic.com>
</commit_message>
<xml_diff>
--- a/docs/cpiv-jcf/submission/manuscript_jcf_draft.docx
+++ b/docs/cpiv-jcf/submission/manuscript_jcf_draft.docx
@@ -2036,43 +2036,7 @@
         <w:pStyle w:val="FirstParagraph"/>
       </w:pPr>
       <w:r>
-        <w:t xml:space="preserve">Five baselines are declared in the addendum. Section 6 scores three of them, the raw midpoint, the bound-filtered midpoint and the protocol; the endpoint interval and the parity residual are described only:</w:t>
-      </w:r>
-      <w:r>
-        <w:t xml:space="preserve"> </w:t>
-      </w:r>
-      <w:r>
-        <w:t xml:space="preserve">the raw midpoint CPIV, with no filter beyond the existence of a finite root;</w:t>
-      </w:r>
-      <w:r>
-        <w:t xml:space="preserve"> </w:t>
-      </w:r>
-      <w:r>
-        <w:t xml:space="preserve">the bound-filtered midpoint CPIV; the bid–ask endpoint interval, reported as</w:t>
-      </w:r>
-      <w:r>
-        <w:t xml:space="preserve"> </w:t>
-      </w:r>
-      <w:r>
-        <w:t xml:space="preserve">an interval rather than a point; the parity residual, labeled throughout as</w:t>
-      </w:r>
-      <w:r>
-        <w:t xml:space="preserve"> </w:t>
-      </w:r>
-      <w:r>
-        <w:t xml:space="preserve">algebraically dependent on the CPIV and so not an independent validation;</w:t>
-      </w:r>
-      <w:r>
-        <w:t xml:space="preserve"> </w:t>
-      </w:r>
-      <w:r>
-        <w:t xml:space="preserve">and the abstention-aware protocol itself, with its certified subset, its</w:t>
-      </w:r>
-      <w:r>
-        <w:t xml:space="preserve"> </w:t>
-      </w:r>
-      <w:r>
-        <w:t xml:space="preserve">abstentions and its funnel.</w:t>
+        <w:t xml:space="preserve">Five baselines are declared in the addendum: the raw midpoint CPIV, with no filter beyond the existence of a finite root; the bound-filtered midpoint CPIV; the bid–ask endpoint interval, reported as an interval rather than a point; the parity residual, labeled throughout as algebraically dependent on the CPIV and so not an independent validation; and the abstention-aware protocol itself, with its certified subset, its abstentions and its funnel. Section 6 scores three of them: the raw midpoint, the bound-filtered midpoint and the protocol. The endpoint interval and the parity residual are described only.</w:t>
       </w:r>
       <w:r>
         <w:t xml:space="preserve"> </w:t>
@@ -3063,7 +3027,7 @@
         <w:t xml:space="preserve"> </w:t>
       </w:r>
       <w:r>
-        <w:t xml:space="preserve">shock are applied to the midpoint of each leg, and every shocked price must</w:t>
+        <w:t xml:space="preserve">shock, each one tick of the quote grid (0.01 in the base market, 0.05 in the coarse-tick specification), are applied to the midpoint of each leg, and every shocked price must</w:t>
       </w:r>
       <w:r>
         <w:t xml:space="preserve"> </w:t>
@@ -4396,7 +4360,7 @@
         <w:t xml:space="preserve"> </w:t>
       </w:r>
       <w:r>
-        <w:t xml:space="preserve">tolerance, the tolerance grid and primary tolerance, the sign band, the</w:t>
+        <w:t xml:space="preserve">tolerance, the tolerance grid and primary tolerance, the sign band (0.05 percentage points, below which a sign disagreement is not counted), the</w:t>
       </w:r>
       <w:r>
         <w:t xml:space="preserve"> </w:t>
@@ -8102,7 +8066,7 @@
         <w:pStyle w:val="BodyText"/>
       </w:pPr>
       <w:r>
-        <w:t xml:space="preserve">R3 and R6 are not computed over the replication draws; the sweep ran them on the development seed alone. An exploratory check outside the tally repeats both on all 23 replication seeds. R3 fails on every seed, because coarse tick, wide quotes and very wide quotes certify no pairs anywhere. R6 passes on every seed, with a worst shift of 0.08 to 0.10. The R3 failure belongs to the specification set, not to the development draw.</w:t>
+        <w:t xml:space="preserve">R3 and R6 are not computed over the replication draws; the sweep ran them on the development seed alone. An exploratory check outside the tally repeats both on all 23 replication seeds. R3 fails on every seed, because coarse tick, wide quotes and very wide quotes certify no pairs anywhere. R6 passes on every seed, with a worst shift of 7.9 to 10.1 percentage points against a threshold of 15. The R3 failure belongs to the specification set, not to the development draw.</w:t>
       </w:r>
     </w:p>
     <w:p>
@@ -9749,7 +9713,7 @@
         <w:pStyle w:val="FirstParagraph"/>
       </w:pPr>
       <w:r>
-        <w:t xml:space="preserve">In the development draw, the raw-midpoint input set contains</w:t>
+        <w:t xml:space="preserve">Of the 889 pairs scored in the development draw, only the 60-day expiry slice supports a surface fit for both input sets. There the raw-midpoint input set contains</w:t>
       </w:r>
       <w:r>
         <w:t xml:space="preserve"> </w:t>
@@ -10922,13 +10886,7 @@
         <w:pStyle w:val="FirstParagraph"/>
       </w:pPr>
       <w:r>
-        <w:t xml:space="preserve">The author used Perplexity for deep research, and Claude (Anthropic) as an editing</w:t>
-      </w:r>
-      <w:r>
-        <w:t xml:space="preserve"> </w:t>
-      </w:r>
-      <w:r>
-        <w:t xml:space="preserve">aid for the language of this manuscript and as a coding aid for the analysis code.</w:t>
+        <w:t xml:space="preserve">The author used Perplexity for deep research, and Claude (Anthropic, model Haiku 5.5, October 2026) as an editing aid for the language of this manuscript and as a coding aid for the analysis code, the test suite and the manuscript build scripts. The pre-registration addendum was written by the author without AI assistance.</w:t>
       </w:r>
       <w:r>
         <w:t xml:space="preserve"> </w:t>

</xml_diff>

<commit_message>
JCF package: fix dating, R3/R6 departure, Table S2 note, cover letter
- Section 5.1 and 5.2: the branch's history first records the addendum in
  e34edbe (30 Oct UTC); afed677 (26 Oct) is on another branch.
- Section 6.6: R3 and R6 run on the development seed, a departure from
  addendum A1.1; the 23-seed repeat is post hoc. Add the R6 power note.
- Table S2 note: shock size and displacement are not in the addendum.
- Cover letter: drop the drafting note; replace "pre-registered" and
  "frozen" with "declared in a dated addendum"; add the AI-use pointer.
- Trim main text to 9,983 words to stay under 10,000.

Co-Authored-By: Claude Haiku 5.5 <noreply@anthropic.com>
</commit_message>
<xml_diff>
--- a/docs/cpiv-jcf/submission/manuscript_jcf_draft.docx
+++ b/docs/cpiv-jcf/submission/manuscript_jcf_draft.docx
@@ -1037,7 +1037,7 @@
         <w:pStyle w:val="FirstParagraph"/>
       </w:pPr>
       <w:r>
-        <w:t xml:space="preserve">The obvious way to answer the previous question is with real quotes. This study does not use them. Option quotes with quote-level timestamps are licensed, no license permitting publication of results derived from them was obtained, and so no market data enters the paper. Options market data is not freely redistributable, and tables derived from quote data one may not redistribute cannot be published.</w:t>
+        <w:t xml:space="preserve">The obvious way to answer the previous question is with real quotes. This study does not use them. Option quotes with quote-level timestamps are licensed, no license permitting publication of results derived from them was obtained, and so no market data enters the paper. Options market data is not freely redistributable.</w:t>
       </w:r>
       <w:r>
         <w:t xml:space="preserve"> </w:t>
@@ -2104,7 +2104,7 @@
         <w:t xml:space="preserve"> </w:t>
       </w:r>
       <w:r>
-        <w:t xml:space="preserve">exactly zero — reported as exactly zero rather than as a small number.</w:t>
+        <w:t xml:space="preserve">exactly zero.</w:t>
       </w:r>
     </w:p>
     <w:bookmarkEnd w:id="22"/>
@@ -4244,7 +4244,7 @@
         <w:t xml:space="preserve"> </w:t>
       </w:r>
       <w:r>
-        <w:t xml:space="preserve">The addendum and the sweep manifest are both dated 22 October 2026. Git first records it on 26 October, after the sweep, so the repository cannot show which came first. The protocol is therefore</w:t>
+        <w:t xml:space="preserve">The addendum and the sweep manifest are both dated 22 October 2026. The repository cannot confirm that order: the first commit on this paper’s branch that records the addendum is dated 30 October, and an earlier commit dated 26 October adds the same file on another branch. Both git records postdate the manifest. The protocol is therefore</w:t>
       </w:r>
       <w:r>
         <w:t xml:space="preserve"> </w:t>
@@ -4348,7 +4348,7 @@
         <w:t xml:space="preserve"> </w:t>
       </w:r>
       <w:r>
-        <w:t xml:space="preserve">addendum and listed in Supplementary Table S2: the inversion map, the root</w:t>
+        <w:t xml:space="preserve">addendum and listed in Supplementary Table S2, which notes the two exceptions: the inversion map, the root</w:t>
       </w:r>
       <w:r>
         <w:t xml:space="preserve"> </w:t>
@@ -5879,13 +5879,13 @@
         <w:t xml:space="preserve"> </w:t>
       </w:r>
       <w:r>
-        <w:t xml:space="preserve">tail is not noise smeared around an estimate; it is a set of pairs where the</w:t>
-      </w:r>
-      <w:r>
-        <w:t xml:space="preserve"> </w:t>
-      </w:r>
-      <w:r>
-        <w:t xml:space="preserve">midpoint is simply not a measurement, and no downstream consumer can tell</w:t>
+        <w:t xml:space="preserve">tail is a set of pairs where the midpoint is not a measurement, and no</w:t>
+      </w:r>
+      <w:r>
+        <w:t xml:space="preserve"> </w:t>
+      </w:r>
+      <w:r>
+        <w:t xml:space="preserve">downstream consumer can tell</w:t>
       </w:r>
       <w:r>
         <w:t xml:space="preserve"> </w:t>
@@ -7272,7 +7272,7 @@
           <w:i/>
           <w:iCs/>
         </w:rPr>
-        <w:t xml:space="preserve">Note: each null draws a subset of exactly the certified size from the same scored universe, over 2000 Monte Carlo trials. The day-block null draws whole underlying-days with replacement. The p-values are add-one estimates. The 0.05 pp row is omitted because no pair is certified at that tolerance in this draw. Coverage is the scored-universe share; Section 6.3 reports the share of attempted. The rows are grid points plus two intermediate points of the seven-point axis in Supplementary B.3.</w:t>
+        <w:t xml:space="preserve">Note: each null draws a subset of exactly the certified size from the same scored universe, over 2000 Monte Carlo trials. The day-block null draws whole underlying-days with replacement. The p-values are add-one estimates. The 0.05 pp row is omitted because no pair is certified at that tolerance in this draw. Coverage is the scored-universe share; Section 6.3 reports the share of attempted. Supplementary B.3 gives the full axis.</w:t>
       </w:r>
     </w:p>
     <w:p>
@@ -8066,7 +8066,7 @@
         <w:pStyle w:val="BodyText"/>
       </w:pPr>
       <w:r>
-        <w:t xml:space="preserve">R3 and R6 are not computed over the replication draws; the sweep ran them on the development seed alone. An exploratory check outside the tally repeats both on all 23 replication seeds. R3 fails on every seed, because coarse tick, wide quotes and very wide quotes certify no pairs anywhere. R6 passes on every seed, with a worst shift of 7.9 to 10.1 percentage points against a threshold of 15. The R3 failure belongs to the specification set, not to the development draw.</w:t>
+        <w:t xml:space="preserve">R3 and R6 are computed on the development seed alone. Addendum A1.1 requires every rule to be evaluated on the 23 replication seeds and excludes the development draw from every rule, so this departs from the declaration. An exploratory check outside the tally, run after the tally and therefore post hoc, repeats both on all 23 replication seeds. R3 fails on every seed, because coarse tick, wide quotes and very wide quotes certify no pairs anywhere. R6 passes on every seed, with a worst shift of 7.9 to 10.1 percentage points against a threshold of 15. On the development seed, base certified coverage is 8.1 per cent (Table 6), so no perturbation can lower it by more than 8.1 points; the stale-timestamp perturbation does so completely. R6 can therefore fail on that seed only through a rise above about 23 per cent.</w:t>
       </w:r>
     </w:p>
     <w:p>
@@ -8155,7 +8155,7 @@
         <w:t xml:space="preserve"> </w:t>
       </w:r>
       <w:r>
-        <w:t xml:space="preserve">It is reported as prominently as the passes. The rule required the minimum</w:t>
+        <w:t xml:space="preserve">The rule required the minimum</w:t>
       </w:r>
       <w:r>
         <w:t xml:space="preserve"> </w:t>
@@ -9552,13 +9552,7 @@
         <w:t xml:space="preserve"> </w:t>
       </w:r>
       <w:r>
-        <w:t xml:space="preserve">uncertainty, which in these units is larger. The certification</w:t>
-      </w:r>
-      <w:r>
-        <w:t xml:space="preserve"> </w:t>
-      </w:r>
-      <w:r>
-        <w:t xml:space="preserve">is a statement about the quotes, not about the inputs. The</w:t>
+        <w:t xml:space="preserve">uncertainty, which in these units is larger. The</w:t>
       </w:r>
       <w:r>
         <w:t xml:space="preserve"> </w:t>
@@ -9640,13 +9634,7 @@
         <w:t xml:space="preserve"> </w:t>
       </w:r>
       <w:r>
-        <w:t xml:space="preserve">supplementary material reports the full cross-tabulation, with the raw</w:t>
-      </w:r>
-      <w:r>
-        <w:t xml:space="preserve"> </w:t>
-      </w:r>
-      <w:r>
-        <w:t xml:space="preserve">midpoint’s error in each cell for comparison.</w:t>
+        <w:t xml:space="preserve">supplementary material gives the full cross-tabulation.</w:t>
       </w:r>
       <w:r>
         <w:t xml:space="preserve"> </w:t>
@@ -9767,13 +9755,7 @@
         <w:t xml:space="preserve"> </w:t>
       </w:r>
       <w:r>
-        <w:t xml:space="preserve">descriptive only: the paper makes no claim that either surface is better</w:t>
-      </w:r>
-      <w:r>
-        <w:t xml:space="preserve"> </w:t>
-      </w:r>
-      <w:r>
-        <w:t xml:space="preserve">specified, better behaved or more profitable.</w:t>
+        <w:t xml:space="preserve">descriptive: neither surface is claimed to be better specified or more profitable.</w:t>
       </w:r>
       <w:r>
         <w:t xml:space="preserve"> </w:t>
@@ -10886,7 +10868,7 @@
         <w:pStyle w:val="FirstParagraph"/>
       </w:pPr>
       <w:r>
-        <w:t xml:space="preserve">The author used Perplexity for deep research, and Claude (Anthropic, model Haiku 5.5, October 2026) as an editing aid for the language of this manuscript and as a coding aid for the analysis code, the test suite and the manuscript build scripts. The pre-registration addendum was written by the author without AI assistance.</w:t>
+        <w:t xml:space="preserve">The author used Perplexity for deep research, and Claude (Anthropic, model Haiku 5.5, October 2026) as an editing aid for the language of this manuscript and as a coding aid for the analysis code, the test suite and the manuscript build scripts. The addendum was written by the author without AI assistance.</w:t>
       </w:r>
       <w:r>
         <w:t xml:space="preserve"> </w:t>

</xml_diff>

<commit_message>
JCF package: fix section 5.2 wording, UTC commit dates, cover letter affiliation
- Section 5.2: name the two exceptions in a parenthesis before the list
  of declared settings, so the list no longer reads as the exceptions.
- Sections 5.1 and the claim matrix: give commit dates in UTC
  (25 Oct for afed677, 30 Oct for e34edbe) instead of mixing UTC and +0700.
- Cover letter: affiliation set to "Independent researcher", matching the
  title page. The email placeholder stays, because the committed letter
  is public.

Co-Authored-By: Claude Haiku 5.5 <noreply@anthropic.com>
</commit_message>
<xml_diff>
--- a/docs/cpiv-jcf/submission/manuscript_jcf_draft.docx
+++ b/docs/cpiv-jcf/submission/manuscript_jcf_draft.docx
@@ -4244,7 +4244,7 @@
         <w:t xml:space="preserve"> </w:t>
       </w:r>
       <w:r>
-        <w:t xml:space="preserve">The addendum and the sweep manifest are both dated 22 October 2026. The repository cannot confirm that order: the first commit on this paper’s branch that records the addendum is dated 30 October, and an earlier commit dated 26 October adds the same file on another branch. Both git records postdate the manifest. The protocol is therefore</w:t>
+        <w:t xml:space="preserve">The addendum and the sweep manifest are both dated 22 October 2026. The repository cannot confirm that order: the first commit on this paper’s branch that records the addendum is dated 30 October UTC, and an earlier commit dated 25 October UTC adds the same file on another branch. Both git records postdate the manifest. The protocol is therefore</w:t>
       </w:r>
       <w:r>
         <w:t xml:space="preserve"> </w:t>
@@ -4348,7 +4348,7 @@
         <w:t xml:space="preserve"> </w:t>
       </w:r>
       <w:r>
-        <w:t xml:space="preserve">addendum and listed in Supplementary Table S2, which notes the two exceptions: the inversion map, the root</w:t>
+        <w:t xml:space="preserve">addendum and listed in Supplementary Table S2, (the finite-shock size and the displacement definition are not in the addendum): the inversion map, the root</w:t>
       </w:r>
       <w:r>
         <w:t xml:space="preserve"> </w:t>

</xml_diff>